<commit_message>
docs: update todo, conflict design doc, remove stale changelog
Co-Authored-By: Claude Opus 4.6 (1M context) <noreply@anthropic.com>
</commit_message>
<xml_diff>
--- a/docs/design/conflict_intelligence_module.docx
+++ b/docs/design/conflict_intelligence_module.docx
@@ -386,7 +386,23 @@
     </w:p>
     <w:p>
       <w:r>
-        <w:t>Interest-based negotiation stands in direct contrast to positional bargaining, where each party stakes out a position and makes concessions. Positional bargaining tends to produce suboptimal outcomes, damage relationships, and entrench adversarial dynamics. The interest-based model instead asks: What does each party actually need? What are the underlying concerns, fears, desires, and constraints that drive the stated positions? By reframing conflict around interests, parties can often discover solutions that positional bargaining would never surface.</w:t>
+        <w:t xml:space="preserve">Interest-based negotiation stands in direct contrast to positional bargaining, where each party stakes out a position and makes concessions. Positional bargaining tends to produce suboptimal outcomes, damage relationships, and entrench adversarial dynamics. The interest-based model instead asks: What does each party </w:t>
+      </w:r>
+      <w:proofErr w:type="gramStart"/>
+      <w:r>
+        <w:t>actually need</w:t>
+      </w:r>
+      <w:proofErr w:type="gramEnd"/>
+      <w:r>
+        <w:t xml:space="preserve">? What are the underlying concerns, fears, desires, and constraints that drive the stated positions? By reframing </w:t>
+      </w:r>
+      <w:proofErr w:type="gramStart"/>
+      <w:r>
+        <w:t>conflict</w:t>
+      </w:r>
+      <w:proofErr w:type="gramEnd"/>
+      <w:r>
+        <w:t xml:space="preserve"> around interests, parties can often discover solutions that positional bargaining would never surface.</w:t>
       </w:r>
     </w:p>
     <w:p>
@@ -830,7 +846,15 @@
     <w:p/>
     <w:p>
       <w:r>
-        <w:t>Fisher and Ury’s emphasis on “inventing options before deciding” is particularly important for the module’s design. The AI does not recommend a single solution; it generates a portfolio of actions across time horizons, allowing managers and HR to select, adapt, and combine interventions based on their contextual knowledge. This mirrors the Getting to Yes principle that good negotiation expands the pie before dividing it.</w:t>
+        <w:t xml:space="preserve">Fisher and Ury’s emphasis on “inventing options before deciding” is particularly important for the module’s design. </w:t>
+      </w:r>
+      <w:proofErr w:type="gramStart"/>
+      <w:r>
+        <w:t>The AI</w:t>
+      </w:r>
+      <w:proofErr w:type="gramEnd"/>
+      <w:r>
+        <w:t xml:space="preserve"> does not recommend a single solution; it generates a portfolio of actions across time horizons, allowing managers and HR to select, adapt, and combine interventions based on their contextual knowledge. This mirrors the Getting to Yes principle that good negotiation expands the pie before dividing it.</w:t>
       </w:r>
     </w:p>
     <w:p>
@@ -865,7 +889,15 @@
     </w:p>
     <w:p>
       <w:r>
-        <w:t>Difficult Conversations (1999), authored by Douglas Stone, Bruce Patton, and Sheila Heen — all members of the Harvard Negotiation Project — extends the interest-based model into the domain of interpersonal workplace conflict. Its central contribution is the Three Conversations framework: every difficult conversation is actually three simultaneous conversations operating beneath the surface.</w:t>
+        <w:t xml:space="preserve">Difficult Conversations (1999), authored by Douglas Stone, Bruce Patton, and Sheila Heen — all members of the Harvard Negotiation Project — extends the interest-based model into the domain of interpersonal workplace conflict. Its central contribution is the Three Conversations framework: every difficult conversation is </w:t>
+      </w:r>
+      <w:proofErr w:type="gramStart"/>
+      <w:r>
+        <w:t>actually three</w:t>
+      </w:r>
+      <w:proofErr w:type="gramEnd"/>
+      <w:r>
+        <w:t xml:space="preserve"> simultaneous conversations operating beneath the surface.</w:t>
       </w:r>
     </w:p>
     <w:p>
@@ -891,8 +923,11 @@
     </w:p>
     <w:p>
       <w:r>
+        <w:t xml:space="preserve">Each party has a different story about what happened, who intended what, and who is to blame. The core error is the assumption that the other party’s intentions are obvious from their actions. In </w:t>
+      </w:r>
+      <w:r>
         <w:lastRenderedPageBreak/>
-        <w:t>Each party has a different story about what happened, who intended what, and who is to blame. The core error is the assumption that the other party’s intentions are obvious from their actions. In workplace conflict, this manifests as attribution errors: “They didn’t respond to my email because they don’t respect my work” versus the reality that they were overwhelmed with competing deadlines.</w:t>
+        <w:t>workplace conflict, this manifests as attribution errors: “They didn’t respond to my email because they don’t respect my work” versus the reality that they were overwhelmed with competing deadlines.</w:t>
       </w:r>
     </w:p>
     <w:p>
@@ -1105,14 +1140,7 @@
               <w:rPr>
                 <w:sz w:val="20"/>
               </w:rPr>
-              <w:t xml:space="preserve">“I don’t feel heard” / </w:t>
-            </w:r>
-            <w:r>
-              <w:rPr>
-                <w:sz w:val="20"/>
-              </w:rPr>
-              <w:lastRenderedPageBreak/>
-              <w:t>withdrawal / sudden outbursts</w:t>
+              <w:t>“I don’t feel heard” / withdrawal / sudden outbursts</w:t>
             </w:r>
           </w:p>
         </w:tc>
@@ -1126,15 +1154,7 @@
               <w:rPr>
                 <w:sz w:val="20"/>
               </w:rPr>
-              <w:lastRenderedPageBreak/>
-              <w:t xml:space="preserve">Psychological Safety, </w:t>
-            </w:r>
-            <w:r>
-              <w:rPr>
-                <w:sz w:val="20"/>
-              </w:rPr>
-              <w:lastRenderedPageBreak/>
-              <w:t>Wellbeing</w:t>
+              <w:t>Psychological Safety, Wellbeing</w:t>
             </w:r>
           </w:p>
         </w:tc>
@@ -1148,15 +1168,21 @@
               <w:rPr>
                 <w:sz w:val="20"/>
               </w:rPr>
-              <w:lastRenderedPageBreak/>
-              <w:t xml:space="preserve">Flags suppressed </w:t>
-            </w:r>
-            <w:r>
-              <w:rPr>
-                <w:sz w:val="20"/>
-              </w:rPr>
-              <w:lastRenderedPageBreak/>
-              <w:t>emotional dynamics; includes emotion-acknowledging language in scripts</w:t>
+              <w:t xml:space="preserve">Flags suppressed emotional dynamics; </w:t>
+            </w:r>
+            <w:proofErr w:type="gramStart"/>
+            <w:r>
+              <w:rPr>
+                <w:sz w:val="20"/>
+              </w:rPr>
+              <w:t>includes</w:t>
+            </w:r>
+            <w:proofErr w:type="gramEnd"/>
+            <w:r>
+              <w:rPr>
+                <w:sz w:val="20"/>
+              </w:rPr>
+              <w:t xml:space="preserve"> emotion-acknowledging language in scripts</w:t>
             </w:r>
           </w:p>
         </w:tc>
@@ -1231,7 +1257,15 @@
     </w:p>
     <w:p>
       <w:r>
-        <w:t>William Ury’s contributions extend well beyond Getting to Yes. His subsequent works provide the conceptual tools for several key features of the Conflict Intelligence module:</w:t>
+        <w:t xml:space="preserve">William Ury’s contributions extend well beyond Getting to Yes. His subsequent works provide </w:t>
+      </w:r>
+      <w:proofErr w:type="gramStart"/>
+      <w:r>
+        <w:t>the conceptual</w:t>
+      </w:r>
+      <w:proofErr w:type="gramEnd"/>
+      <w:r>
+        <w:t xml:space="preserve"> tools for several key features of the Conflict Intelligence module:</w:t>
       </w:r>
     </w:p>
     <w:p>
@@ -1261,11 +1295,33 @@
       </w:r>
     </w:p>
     <w:p>
+      <w:proofErr w:type="gramStart"/>
       <w:r>
         <w:rPr>
           <w:b/>
         </w:rPr>
-        <w:t>Getting to Yes with Yourself (2015)</w:t>
+        <w:t>Getting to</w:t>
+      </w:r>
+      <w:proofErr w:type="gramEnd"/>
+      <w:r>
+        <w:rPr>
+          <w:b/>
+        </w:rPr>
+        <w:t xml:space="preserve"> </w:t>
+      </w:r>
+      <w:proofErr w:type="gramStart"/>
+      <w:r>
+        <w:rPr>
+          <w:b/>
+        </w:rPr>
+        <w:t>Yes with</w:t>
+      </w:r>
+      <w:proofErr w:type="gramEnd"/>
+      <w:r>
+        <w:rPr>
+          <w:b/>
+        </w:rPr>
+        <w:t xml:space="preserve"> Yourself (2015)</w:t>
       </w:r>
     </w:p>
     <w:p>
@@ -1278,7 +1334,6 @@
         <w:pStyle w:val="Heading2"/>
       </w:pPr>
       <w:r>
-        <w:lastRenderedPageBreak/>
         <w:t>2.5 Synthesis: From Theory to Software</w:t>
       </w:r>
     </w:p>
@@ -1293,6 +1348,7 @@
         <w:ind w:left="850"/>
       </w:pPr>
       <w:r>
+        <w:lastRenderedPageBreak/>
         <w:t>Survey instruments detect the Three Conversations at scale, across teams and time periods, without requiring anyone to narrate their side of the story.</w:t>
       </w:r>
     </w:p>
@@ -1484,7 +1540,21 @@
               <w:rPr>
                 <w:sz w:val="20"/>
               </w:rPr>
-              <w:t>Whether employees can express concerns without fear; whether identity feels safe</w:t>
+              <w:t xml:space="preserve">Whether employees can express concerns without </w:t>
+            </w:r>
+            <w:proofErr w:type="gramStart"/>
+            <w:r>
+              <w:rPr>
+                <w:sz w:val="20"/>
+              </w:rPr>
+              <w:t>fear;</w:t>
+            </w:r>
+            <w:proofErr w:type="gramEnd"/>
+            <w:r>
+              <w:rPr>
+                <w:sz w:val="20"/>
+              </w:rPr>
+              <w:t xml:space="preserve"> whether identity feels safe</w:t>
             </w:r>
           </w:p>
         </w:tc>
@@ -1544,7 +1614,21 @@
               <w:rPr>
                 <w:sz w:val="20"/>
               </w:rPr>
-              <w:t>Whether information flows accurately; whether commitments are honoured</w:t>
+              <w:t xml:space="preserve">Whether information flows </w:t>
+            </w:r>
+            <w:proofErr w:type="gramStart"/>
+            <w:r>
+              <w:rPr>
+                <w:sz w:val="20"/>
+              </w:rPr>
+              <w:t>accurately;</w:t>
+            </w:r>
+            <w:proofErr w:type="gramEnd"/>
+            <w:r>
+              <w:rPr>
+                <w:sz w:val="20"/>
+              </w:rPr>
+              <w:t xml:space="preserve"> whether commitments are honoured</w:t>
             </w:r>
           </w:p>
         </w:tc>
@@ -1602,7 +1686,21 @@
               <w:rPr>
                 <w:sz w:val="20"/>
               </w:rPr>
-              <w:t>How often conflict surfaces; whether it’s resolved or accumulating</w:t>
+              <w:t xml:space="preserve">How often conflict </w:t>
+            </w:r>
+            <w:proofErr w:type="gramStart"/>
+            <w:r>
+              <w:rPr>
+                <w:sz w:val="20"/>
+              </w:rPr>
+              <w:t>surfaces;</w:t>
+            </w:r>
+            <w:proofErr w:type="gramEnd"/>
+            <w:r>
+              <w:rPr>
+                <w:sz w:val="20"/>
+              </w:rPr>
+              <w:t xml:space="preserve"> whether it’s resolved or accumulating</w:t>
             </w:r>
           </w:p>
         </w:tc>
@@ -1634,7 +1732,6 @@
               <w:rPr>
                 <w:sz w:val="20"/>
               </w:rPr>
-              <w:lastRenderedPageBreak/>
               <w:t>Management Effectiveness</w:t>
             </w:r>
           </w:p>
@@ -1753,8 +1850,17 @@
               <w:rPr>
                 <w:sz w:val="20"/>
               </w:rPr>
-              <w:t>Wellbeing &amp; Belonging</w:t>
-            </w:r>
+              <w:lastRenderedPageBreak/>
+              <w:t xml:space="preserve">Wellbeing &amp; </w:t>
+            </w:r>
+            <w:proofErr w:type="gramStart"/>
+            <w:r>
+              <w:rPr>
+                <w:sz w:val="20"/>
+              </w:rPr>
+              <w:t>Belonging</w:t>
+            </w:r>
+            <w:proofErr w:type="gramEnd"/>
           </w:p>
         </w:tc>
         <w:tc>
@@ -1993,7 +2099,6 @@
         <w:pStyle w:val="Heading2"/>
       </w:pPr>
       <w:r>
-        <w:lastRenderedPageBreak/>
         <w:t>3.3 Manager Conversation Guide — Principled Negotiation in Practice</w:t>
       </w:r>
     </w:p>
@@ -2026,6 +2131,7 @@
         <w:rPr>
           <w:b/>
         </w:rPr>
+        <w:lastRenderedPageBreak/>
         <w:t xml:space="preserve">Key Questions: </w:t>
       </w:r>
       <w:r>
@@ -2186,7 +2292,21 @@
               <w:rPr>
                 <w:sz w:val="20"/>
               </w:rPr>
-              <w:t>Schedule 1:1 check-ins with each team member to understand their perspective</w:t>
+              <w:t xml:space="preserve">Schedule 1:1 </w:t>
+            </w:r>
+            <w:proofErr w:type="gramStart"/>
+            <w:r>
+              <w:rPr>
+                <w:sz w:val="20"/>
+              </w:rPr>
+              <w:t>check-ins</w:t>
+            </w:r>
+            <w:proofErr w:type="gramEnd"/>
+            <w:r>
+              <w:rPr>
+                <w:sz w:val="20"/>
+              </w:rPr>
+              <w:t xml:space="preserve"> with each team member to understand their perspective</w:t>
             </w:r>
           </w:p>
         </w:tc>
@@ -2390,7 +2510,6 @@
         <w:pStyle w:val="Heading2"/>
       </w:pPr>
       <w:r>
-        <w:lastRenderedPageBreak/>
         <w:t>3.5 Escalation Pathway — The Third Side</w:t>
       </w:r>
     </w:p>
@@ -2522,6 +2641,7 @@
               <w:rPr>
                 <w:sz w:val="20"/>
               </w:rPr>
+              <w:lastRenderedPageBreak/>
               <w:t>2. Initial Consultation</w:t>
             </w:r>
           </w:p>
@@ -2594,7 +2714,21 @@
               <w:rPr>
                 <w:sz w:val="20"/>
               </w:rPr>
-              <w:t>Full Harvard method: separate people from problem, explore interests, generate options</w:t>
+              <w:t xml:space="preserve">Full Harvard method: separate people from </w:t>
+            </w:r>
+            <w:proofErr w:type="gramStart"/>
+            <w:r>
+              <w:rPr>
+                <w:sz w:val="20"/>
+              </w:rPr>
+              <w:t>problem</w:t>
+            </w:r>
+            <w:proofErr w:type="gramEnd"/>
+            <w:r>
+              <w:rPr>
+                <w:sz w:val="20"/>
+              </w:rPr>
+              <w:t>, explore interests, generate options</w:t>
             </w:r>
           </w:p>
         </w:tc>
@@ -2650,7 +2784,15 @@
     <w:p/>
     <w:p>
       <w:r>
-        <w:t>The escalation pathway is deliberately not automated. Conflict at the high/critical level involves identity-level dynamics (the Identity Conversation) that require human judgment, empathy, and relational skill. The AI provides the diagnostic intelligence; a skilled human provides the facilitation.</w:t>
+        <w:t xml:space="preserve">The escalation pathway is deliberately not automated. Conflict at the high/critical level involves identity-level dynamics (the Identity Conversation) that require human judgment, empathy, and relational skill. The AI provides </w:t>
+      </w:r>
+      <w:proofErr w:type="gramStart"/>
+      <w:r>
+        <w:t>the diagnostic</w:t>
+      </w:r>
+      <w:proofErr w:type="gramEnd"/>
+      <w:r>
+        <w:t xml:space="preserve"> intelligence; a skilled human provides the facilitation.</w:t>
       </w:r>
     </w:p>
     <w:p/>
@@ -2705,7 +2847,6 @@
           <w:b/>
           <w:color w:val="1B2A47"/>
         </w:rPr>
-        <w:lastRenderedPageBreak/>
         <w:t xml:space="preserve">Stage 3: AI Analysis. </w:t>
       </w:r>
       <w:r>
@@ -2741,6 +2882,7 @@
         <w:pStyle w:val="Heading2"/>
       </w:pPr>
       <w:r>
+        <w:lastRenderedPageBreak/>
         <w:t>4.2 AI Prompt Design Philosophy</w:t>
       </w:r>
     </w:p>
@@ -3120,14 +3262,7 @@
               <w:rPr>
                 <w:sz w:val="20"/>
               </w:rPr>
-              <w:t xml:space="preserve">Escalate to professional mediation; immediate safety and wellbeing </w:t>
-            </w:r>
-            <w:r>
-              <w:rPr>
-                <w:sz w:val="20"/>
-              </w:rPr>
-              <w:lastRenderedPageBreak/>
-              <w:t>measures</w:t>
+              <w:t>Escalate to professional mediation; immediate safety and wellbeing measures</w:t>
             </w:r>
           </w:p>
         </w:tc>
@@ -3185,6 +3320,7 @@
                 <w:color w:val="FFFFFF"/>
                 <w:sz w:val="20"/>
               </w:rPr>
+              <w:lastRenderedPageBreak/>
               <w:t>Category</w:t>
             </w:r>
           </w:p>
@@ -3290,7 +3426,21 @@
               <w:rPr>
                 <w:sz w:val="20"/>
               </w:rPr>
-              <w:t>Can employees express concerns without fear? Have they witnessed unsafe behaviour?</w:t>
+              <w:t xml:space="preserve">Can </w:t>
+            </w:r>
+            <w:proofErr w:type="gramStart"/>
+            <w:r>
+              <w:rPr>
+                <w:sz w:val="20"/>
+              </w:rPr>
+              <w:t>employees</w:t>
+            </w:r>
+            <w:proofErr w:type="gramEnd"/>
+            <w:r>
+              <w:rPr>
+                <w:sz w:val="20"/>
+              </w:rPr>
+              <w:t xml:space="preserve"> express concerns without fear? Have they witnessed unsafe behaviour?</w:t>
             </w:r>
           </w:p>
         </w:tc>
@@ -3599,7 +3749,6 @@
         <w:pStyle w:val="Heading2"/>
       </w:pPr>
       <w:r>
-        <w:lastRenderedPageBreak/>
         <w:t>5.2 Quarterly Deep-Dive Analysis (21 items)</w:t>
       </w:r>
     </w:p>
@@ -3921,7 +4070,14 @@
               <w:rPr>
                 <w:sz w:val="20"/>
               </w:rPr>
-              <w:t>Manager modelling; handling of complaints; trust in HR; avoidance of escalation</w:t>
+              <w:t xml:space="preserve">Manager modelling; handling of complaints; </w:t>
+            </w:r>
+            <w:r>
+              <w:rPr>
+                <w:sz w:val="20"/>
+              </w:rPr>
+              <w:lastRenderedPageBreak/>
+              <w:t>trust in HR; avoidance of escalation</w:t>
             </w:r>
           </w:p>
         </w:tc>
@@ -3939,6 +4095,7 @@
               <w:rPr>
                 <w:sz w:val="20"/>
               </w:rPr>
+              <w:lastRenderedPageBreak/>
               <w:t>Workload &amp; Structural Stressors</w:t>
             </w:r>
           </w:p>
@@ -4170,7 +4327,6 @@
         <w:rPr>
           <w:b/>
         </w:rPr>
-        <w:lastRenderedPageBreak/>
         <w:t xml:space="preserve">Mixed methods: </w:t>
       </w:r>
       <w:r>
@@ -4188,12 +4344,28 @@
     </w:p>
     <w:p>
       <w:r>
-        <w:t>The escalation pathway is the module’s implementation of William Ury’s Third Side principle. It activates when the conflict has exceeded the capacity of the immediate parties to resolve it — typically at the high or critical risk level.</w:t>
-      </w:r>
-    </w:p>
-    <w:p>
-      <w:r>
-        <w:t>The pathway is deliberately human-centred. AI provides the diagnostic intelligence, but the mediation itself is conducted by a skilled professional (Helena) using the full interest-based mediation methodology:</w:t>
+        <w:t xml:space="preserve">The escalation pathway is the module’s implementation of William Ury’s Third Side principle. It </w:t>
+      </w:r>
+      <w:proofErr w:type="gramStart"/>
+      <w:r>
+        <w:t>activates</w:t>
+      </w:r>
+      <w:proofErr w:type="gramEnd"/>
+      <w:r>
+        <w:t xml:space="preserve"> when the conflict has exceeded the capacity of the immediate parties to resolve it — typically at the high or critical risk level.</w:t>
+      </w:r>
+    </w:p>
+    <w:p>
+      <w:r>
+        <w:t xml:space="preserve">The pathway is deliberately human-centred. AI provides </w:t>
+      </w:r>
+      <w:proofErr w:type="gramStart"/>
+      <w:r>
+        <w:t>the diagnostic</w:t>
+      </w:r>
+      <w:proofErr w:type="gramEnd"/>
+      <w:r>
+        <w:t xml:space="preserve"> intelligence, but the mediation itself is conducted by a skilled professional (Helena) using the full interest-based mediation methodology:</w:t>
       </w:r>
     </w:p>
     <w:p>
@@ -4220,6 +4392,7 @@
         <w:rPr>
           <w:b/>
         </w:rPr>
+        <w:lastRenderedPageBreak/>
         <w:t xml:space="preserve">Mediation: </w:t>
       </w:r>
       <w:r>
@@ -4316,7 +4489,6 @@
         <w:ind w:left="850"/>
       </w:pPr>
       <w:r>
-        <w:lastRenderedPageBreak/>
         <w:t>Manager Conversation Templates — pre-structured scripts for common conflict scenarios</w:t>
       </w:r>
     </w:p>
@@ -4361,7 +4533,15 @@
         <w:ind w:left="850"/>
       </w:pPr>
       <w:r>
-        <w:t>Thomas-Kilmann Instrument (TKI) — conflict handling mode assessment</w:t>
+        <w:t>Thomas-Kilmann Instrument (</w:t>
+      </w:r>
+      <w:proofErr w:type="gramStart"/>
+      <w:r>
+        <w:t>TKI) —</w:t>
+      </w:r>
+      <w:proofErr w:type="gramEnd"/>
+      <w:r>
+        <w:t xml:space="preserve"> conflict handling mode assessment</w:t>
       </w:r>
     </w:p>
     <w:p>
@@ -4383,6 +4563,149 @@
       </w:r>
     </w:p>
     <w:p/>
+    <w:p>
+      <w:pPr>
+        <w:pStyle w:val="Heading3"/>
+      </w:pPr>
+      <w:r>
+        <w:lastRenderedPageBreak/>
+        <w:t>Public domain</w:t>
+      </w:r>
+    </w:p>
+    <w:p>
+      <w:r>
+        <w:t xml:space="preserve"> </w:t>
+      </w:r>
+      <w:r>
+        <w:t>TKI</w:t>
+      </w:r>
+      <w:r>
+        <w:t xml:space="preserve"> is a proprietary, copyrighted instrument owned by The Myers-Briggs Company (formerly CPP, Inc.). The actual question pairs, scoring norms, and administration        </w:t>
+      </w:r>
+    </w:p>
+    <w:p>
+      <w:r>
+        <w:t xml:space="preserve">    materials are not public domain — they are commercially licensed.               </w:t>
+      </w:r>
+    </w:p>
+    <w:p>
+      <w:r>
+        <w:t xml:space="preserve">                                                                                                                                                                                 </w:t>
+      </w:r>
+    </w:p>
+    <w:p>
+      <w:r>
+        <w:rPr>
+          <w:b/>
+          <w:bCs/>
+        </w:rPr>
+        <w:t xml:space="preserve">    To use the official TKI legitimately</w:t>
+      </w:r>
+      <w:r>
+        <w:t xml:space="preserve">, you would need to:                                                                                                                 </w:t>
+      </w:r>
+    </w:p>
+    <w:p>
+      <w:r>
+        <w:t xml:space="preserve">    - Purchase it through https://kilmanndiagnostics.com or The Myers-Briggs Company                                                                                             </w:t>
+      </w:r>
+    </w:p>
+    <w:p>
+      <w:r>
+        <w:t xml:space="preserve">    - Each administration typically costs per person                                                                                                                         </w:t>
+      </w:r>
+    </w:p>
+    <w:p>
+      <w:r>
+        <w:t xml:space="preserve">    - You cannot reproduce the original 30 question pairs in your software                                                                                                     </w:t>
+      </w:r>
+    </w:p>
+    <w:p>
+      <w:r>
+        <w:t xml:space="preserve">                                                                                             </w:t>
+      </w:r>
+    </w:p>
+    <w:p>
+      <w:r>
+        <w:t xml:space="preserve">    What we have seeded in ARTES is a custom adaptation — paraphrased forced-choice questions that measure the same 5 conflict modes (competing, collaborating, compromising,</w:t>
+      </w:r>
+    </w:p>
+    <w:p>
+      <w:r>
+        <w:t xml:space="preserve">    avoiding, accommodating) along the same two dimensions (assertiveness × cooperativeness). The underlying two-dimensional model and the five mode names are well-established</w:t>
+      </w:r>
+    </w:p>
+    <w:p>
+      <w:r>
+        <w:t xml:space="preserve">    in academic literature and are not proprietary. But the specific TKI question wording is.                                                    </w:t>
+      </w:r>
+    </w:p>
+    <w:p>
+      <w:r>
+        <w:t xml:space="preserve">                                                                                                                                            </w:t>
+      </w:r>
+    </w:p>
+    <w:p>
+      <w:pPr>
+        <w:rPr>
+          <w:b/>
+          <w:bCs/>
+        </w:rPr>
+      </w:pPr>
+      <w:r>
+        <w:rPr>
+          <w:b/>
+          <w:bCs/>
+        </w:rPr>
+        <w:t xml:space="preserve">    Options going forward:                                                                                                         </w:t>
+      </w:r>
+    </w:p>
+    <w:p>
+      <w:pPr>
+        <w:pStyle w:val="ListParagraph"/>
+        <w:numPr>
+          <w:ilvl w:val="0"/>
+          <w:numId w:val="11"/>
+        </w:numPr>
+      </w:pPr>
+      <w:r>
+        <w:t>External link only — link users to the official TKI site to take it there (already in the skill building section), import results manually</w:t>
+      </w:r>
+    </w:p>
+    <w:p>
+      <w:pPr>
+        <w:pStyle w:val="ListParagraph"/>
+        <w:numPr>
+          <w:ilvl w:val="0"/>
+          <w:numId w:val="11"/>
+        </w:numPr>
+      </w:pPr>
+      <w:r>
+        <w:t>Keep the custom adaptation — rename it to something like "Conflict Handling Style Assessment" to avoid implying it's the official TKI</w:t>
+      </w:r>
+    </w:p>
+    <w:p>
+      <w:pPr>
+        <w:pStyle w:val="ListParagraph"/>
+        <w:numPr>
+          <w:ilvl w:val="0"/>
+          <w:numId w:val="11"/>
+        </w:numPr>
+      </w:pPr>
+      <w:r>
+        <w:t>License the TKI — contact The Myers-Briggs Company for a digital integration license (expensive, typically enterprise-level)</w:t>
+      </w:r>
+    </w:p>
+    <w:p>
+      <w:r>
+        <w:t xml:space="preserve">                                                                                                                                                                                 </w:t>
+      </w:r>
+    </w:p>
+    <w:p>
+      <w:r>
+        <w:t xml:space="preserve">    Option 2 is the safest — we keep the instrument but drop the TKI branding. The five-mode model itself is freely usable.</w:t>
+      </w:r>
+    </w:p>
     <w:p>
       <w:pPr>
         <w:pStyle w:val="Heading1"/>
@@ -4420,10 +4743,24 @@
         <w:rPr>
           <w:b/>
         </w:rPr>
+        <w:lastRenderedPageBreak/>
         <w:t xml:space="preserve">AI as advisor, not judge: </w:t>
       </w:r>
-      <w:r>
-        <w:t>The AI is a diagnostic tool, not an adjudicator. It identifies patterns and suggests frameworks; it does not determine fault, recommend discipline, or make decisions about individuals. All AI outputs explicitly state that they are starting points for human judgment, not conclusions.</w:t>
+      <w:proofErr w:type="gramStart"/>
+      <w:r>
+        <w:t>The AI</w:t>
+      </w:r>
+      <w:proofErr w:type="gramEnd"/>
+      <w:r>
+        <w:t xml:space="preserve"> is a diagnostic tool, not an adjudicator. It identifies patterns and suggests frameworks; it does not determine </w:t>
+      </w:r>
+      <w:proofErr w:type="gramStart"/>
+      <w:r>
+        <w:t>fault</w:t>
+      </w:r>
+      <w:proofErr w:type="gramEnd"/>
+      <w:r>
+        <w:t>, recommend discipline, or make decisions about individuals. All AI outputs explicitly state that they are starting points for human judgment, not conclusions.</w:t>
       </w:r>
     </w:p>
     <w:p>
@@ -4438,7 +4775,15 @@
         <w:t xml:space="preserve">Data isolation: </w:t>
       </w:r>
       <w:r>
-        <w:t>Analysis data is tenant-isolated. No cross-organisation data sharing occurs. Each organisation’s data is stored and processed independently.</w:t>
+        <w:t xml:space="preserve">Analysis data is </w:t>
+      </w:r>
+      <w:proofErr w:type="gramStart"/>
+      <w:r>
+        <w:t>tenant-isolated</w:t>
+      </w:r>
+      <w:proofErr w:type="gramEnd"/>
+      <w:r>
+        <w:t>. No cross-organisation data sharing occurs. Each organisation’s data is stored and processed independently.</w:t>
       </w:r>
     </w:p>
     <w:p>
@@ -4468,7 +4813,15 @@
         <w:t xml:space="preserve">Manager autonomy: </w:t>
       </w:r>
       <w:r>
-        <w:t>Manager scripts are scaffolds, not mandates. They provide suggested language and structure, but explicitly preserve space for contextual adaptation. The goal is to equip managers, not to script them.</w:t>
+        <w:t xml:space="preserve">Manager scripts are scaffolds, not mandates. They provide suggested language and </w:t>
+      </w:r>
+      <w:proofErr w:type="gramStart"/>
+      <w:r>
+        <w:t>structure, but</w:t>
+      </w:r>
+      <w:proofErr w:type="gramEnd"/>
+      <w:r>
+        <w:t xml:space="preserve"> explicitly preserve space for contextual adaptation. The goal is to equip managers, not to script them.</w:t>
       </w:r>
     </w:p>
     <w:p/>
@@ -4477,7 +4830,6 @@
         <w:pStyle w:val="Heading1"/>
       </w:pPr>
       <w:r>
-        <w:lastRenderedPageBreak/>
         <w:t>9. References &amp; Further Reading</w:t>
       </w:r>
     </w:p>
@@ -4498,7 +4850,21 @@
         <w:rPr>
           <w:sz w:val="20"/>
         </w:rPr>
-        <w:t>Fisher, R., Ury, W. &amp; Patton, B. (2011). Getting to Yes: Negotiating Agreement Without Giving In. 3rd edition. Penguin Books.</w:t>
+        <w:t xml:space="preserve">Fisher, R., Ury, W. &amp; Patton, B. (2011). </w:t>
+      </w:r>
+      <w:proofErr w:type="gramStart"/>
+      <w:r>
+        <w:rPr>
+          <w:sz w:val="20"/>
+        </w:rPr>
+        <w:t>Getting to</w:t>
+      </w:r>
+      <w:proofErr w:type="gramEnd"/>
+      <w:r>
+        <w:rPr>
+          <w:sz w:val="20"/>
+        </w:rPr>
+        <w:t xml:space="preserve"> Yes: Negotiating Agreement Without Giving In. 3rd edition. Penguin Books.</w:t>
       </w:r>
     </w:p>
     <w:p>
@@ -4546,7 +4912,21 @@
         <w:rPr>
           <w:sz w:val="20"/>
         </w:rPr>
-        <w:t>Ury, W. (2015). Getting to Yes with Yourself: And Other Worthy Opponents. HarperOne.</w:t>
+        <w:t xml:space="preserve">Ury, W. (2015). </w:t>
+      </w:r>
+      <w:proofErr w:type="gramStart"/>
+      <w:r>
+        <w:rPr>
+          <w:sz w:val="20"/>
+        </w:rPr>
+        <w:t>Getting to</w:t>
+      </w:r>
+      <w:proofErr w:type="gramEnd"/>
+      <w:r>
+        <w:rPr>
+          <w:sz w:val="20"/>
+        </w:rPr>
+        <w:t xml:space="preserve"> Yes with Yourself: And Other Worthy Opponents. HarperOne.</w:t>
       </w:r>
     </w:p>
     <w:p>
@@ -4590,7 +4970,21 @@
         <w:rPr>
           <w:sz w:val="20"/>
         </w:rPr>
-        <w:t>Shapiro, D. (2016). Negotiating the Nonnegotiable: How to Resolve Your Most Emotionally Charged Conflicts. Viking.</w:t>
+        <w:t xml:space="preserve">Shapiro, D. (2016). Negotiating </w:t>
+      </w:r>
+      <w:proofErr w:type="gramStart"/>
+      <w:r>
+        <w:rPr>
+          <w:sz w:val="20"/>
+        </w:rPr>
+        <w:t>the Nonnegotiable</w:t>
+      </w:r>
+      <w:proofErr w:type="gramEnd"/>
+      <w:r>
+        <w:rPr>
+          <w:sz w:val="20"/>
+        </w:rPr>
+        <w:t>: How to Resolve Your Most Emotionally Charged Conflicts. Viking.</w:t>
       </w:r>
     </w:p>
     <w:p>
@@ -4812,6 +5206,181 @@
       <w:rPr>
         <w:rFonts w:ascii="Symbol" w:hAnsi="Symbol" w:hint="default"/>
       </w:rPr>
+    </w:lvl>
+  </w:abstractNum>
+  <w:abstractNum w:abstractNumId="9" w15:restartNumberingAfterBreak="0">
+    <w:nsid w:val="431407AB"/>
+    <w:multiLevelType w:val="hybridMultilevel"/>
+    <w:tmpl w:val="C97E87B4"/>
+    <w:lvl w:ilvl="0" w:tplc="A5B0D61E">
+      <w:start w:val="1"/>
+      <w:numFmt w:val="decimal"/>
+      <w:lvlText w:val="%1."/>
+      <w:lvlJc w:val="left"/>
+      <w:pPr>
+        <w:ind w:left="564" w:hanging="360"/>
+      </w:pPr>
+      <w:rPr>
+        <w:rFonts w:hint="default"/>
+      </w:rPr>
+    </w:lvl>
+    <w:lvl w:ilvl="1" w:tplc="10090019" w:tentative="1">
+      <w:start w:val="1"/>
+      <w:numFmt w:val="lowerLetter"/>
+      <w:lvlText w:val="%2."/>
+      <w:lvlJc w:val="left"/>
+      <w:pPr>
+        <w:ind w:left="1284" w:hanging="360"/>
+      </w:pPr>
+    </w:lvl>
+    <w:lvl w:ilvl="2" w:tplc="1009001B" w:tentative="1">
+      <w:start w:val="1"/>
+      <w:numFmt w:val="lowerRoman"/>
+      <w:lvlText w:val="%3."/>
+      <w:lvlJc w:val="right"/>
+      <w:pPr>
+        <w:ind w:left="2004" w:hanging="180"/>
+      </w:pPr>
+    </w:lvl>
+    <w:lvl w:ilvl="3" w:tplc="1009000F" w:tentative="1">
+      <w:start w:val="1"/>
+      <w:numFmt w:val="decimal"/>
+      <w:lvlText w:val="%4."/>
+      <w:lvlJc w:val="left"/>
+      <w:pPr>
+        <w:ind w:left="2724" w:hanging="360"/>
+      </w:pPr>
+    </w:lvl>
+    <w:lvl w:ilvl="4" w:tplc="10090019" w:tentative="1">
+      <w:start w:val="1"/>
+      <w:numFmt w:val="lowerLetter"/>
+      <w:lvlText w:val="%5."/>
+      <w:lvlJc w:val="left"/>
+      <w:pPr>
+        <w:ind w:left="3444" w:hanging="360"/>
+      </w:pPr>
+    </w:lvl>
+    <w:lvl w:ilvl="5" w:tplc="1009001B" w:tentative="1">
+      <w:start w:val="1"/>
+      <w:numFmt w:val="lowerRoman"/>
+      <w:lvlText w:val="%6."/>
+      <w:lvlJc w:val="right"/>
+      <w:pPr>
+        <w:ind w:left="4164" w:hanging="180"/>
+      </w:pPr>
+    </w:lvl>
+    <w:lvl w:ilvl="6" w:tplc="1009000F" w:tentative="1">
+      <w:start w:val="1"/>
+      <w:numFmt w:val="decimal"/>
+      <w:lvlText w:val="%7."/>
+      <w:lvlJc w:val="left"/>
+      <w:pPr>
+        <w:ind w:left="4884" w:hanging="360"/>
+      </w:pPr>
+    </w:lvl>
+    <w:lvl w:ilvl="7" w:tplc="10090019" w:tentative="1">
+      <w:start w:val="1"/>
+      <w:numFmt w:val="lowerLetter"/>
+      <w:lvlText w:val="%8."/>
+      <w:lvlJc w:val="left"/>
+      <w:pPr>
+        <w:ind w:left="5604" w:hanging="360"/>
+      </w:pPr>
+    </w:lvl>
+    <w:lvl w:ilvl="8" w:tplc="1009001B" w:tentative="1">
+      <w:start w:val="1"/>
+      <w:numFmt w:val="lowerRoman"/>
+      <w:lvlText w:val="%9."/>
+      <w:lvlJc w:val="right"/>
+      <w:pPr>
+        <w:ind w:left="6324" w:hanging="180"/>
+      </w:pPr>
+    </w:lvl>
+  </w:abstractNum>
+  <w:abstractNum w:abstractNumId="10" w15:restartNumberingAfterBreak="0">
+    <w:nsid w:val="7B901D4C"/>
+    <w:multiLevelType w:val="hybridMultilevel"/>
+    <w:tmpl w:val="3878B150"/>
+    <w:lvl w:ilvl="0" w:tplc="1009000F">
+      <w:start w:val="1"/>
+      <w:numFmt w:val="decimal"/>
+      <w:lvlText w:val="%1."/>
+      <w:lvlJc w:val="left"/>
+      <w:pPr>
+        <w:ind w:left="720" w:hanging="360"/>
+      </w:pPr>
+    </w:lvl>
+    <w:lvl w:ilvl="1" w:tplc="10090019" w:tentative="1">
+      <w:start w:val="1"/>
+      <w:numFmt w:val="lowerLetter"/>
+      <w:lvlText w:val="%2."/>
+      <w:lvlJc w:val="left"/>
+      <w:pPr>
+        <w:ind w:left="1440" w:hanging="360"/>
+      </w:pPr>
+    </w:lvl>
+    <w:lvl w:ilvl="2" w:tplc="1009001B" w:tentative="1">
+      <w:start w:val="1"/>
+      <w:numFmt w:val="lowerRoman"/>
+      <w:lvlText w:val="%3."/>
+      <w:lvlJc w:val="right"/>
+      <w:pPr>
+        <w:ind w:left="2160" w:hanging="180"/>
+      </w:pPr>
+    </w:lvl>
+    <w:lvl w:ilvl="3" w:tplc="1009000F" w:tentative="1">
+      <w:start w:val="1"/>
+      <w:numFmt w:val="decimal"/>
+      <w:lvlText w:val="%4."/>
+      <w:lvlJc w:val="left"/>
+      <w:pPr>
+        <w:ind w:left="2880" w:hanging="360"/>
+      </w:pPr>
+    </w:lvl>
+    <w:lvl w:ilvl="4" w:tplc="10090019" w:tentative="1">
+      <w:start w:val="1"/>
+      <w:numFmt w:val="lowerLetter"/>
+      <w:lvlText w:val="%5."/>
+      <w:lvlJc w:val="left"/>
+      <w:pPr>
+        <w:ind w:left="3600" w:hanging="360"/>
+      </w:pPr>
+    </w:lvl>
+    <w:lvl w:ilvl="5" w:tplc="1009001B" w:tentative="1">
+      <w:start w:val="1"/>
+      <w:numFmt w:val="lowerRoman"/>
+      <w:lvlText w:val="%6."/>
+      <w:lvlJc w:val="right"/>
+      <w:pPr>
+        <w:ind w:left="4320" w:hanging="180"/>
+      </w:pPr>
+    </w:lvl>
+    <w:lvl w:ilvl="6" w:tplc="1009000F" w:tentative="1">
+      <w:start w:val="1"/>
+      <w:numFmt w:val="decimal"/>
+      <w:lvlText w:val="%7."/>
+      <w:lvlJc w:val="left"/>
+      <w:pPr>
+        <w:ind w:left="5040" w:hanging="360"/>
+      </w:pPr>
+    </w:lvl>
+    <w:lvl w:ilvl="7" w:tplc="10090019" w:tentative="1">
+      <w:start w:val="1"/>
+      <w:numFmt w:val="lowerLetter"/>
+      <w:lvlText w:val="%8."/>
+      <w:lvlJc w:val="left"/>
+      <w:pPr>
+        <w:ind w:left="5760" w:hanging="360"/>
+      </w:pPr>
+    </w:lvl>
+    <w:lvl w:ilvl="8" w:tplc="1009001B" w:tentative="1">
+      <w:start w:val="1"/>
+      <w:numFmt w:val="lowerRoman"/>
+      <w:lvlText w:val="%9."/>
+      <w:lvlJc w:val="right"/>
+      <w:pPr>
+        <w:ind w:left="6480" w:hanging="180"/>
+      </w:pPr>
     </w:lvl>
   </w:abstractNum>
   <w:num w:numId="1" w16cid:durableId="703099267">
@@ -4840,6 +5409,12 @@
   </w:num>
   <w:num w:numId="9" w16cid:durableId="1339652819">
     <w:abstractNumId w:val="0"/>
+  </w:num>
+  <w:num w:numId="10" w16cid:durableId="321126862">
+    <w:abstractNumId w:val="10"/>
+  </w:num>
+  <w:num w:numId="11" w16cid:durableId="1726104228">
+    <w:abstractNumId w:val="9"/>
   </w:num>
 </w:numbering>
 </file>

</xml_diff>